<commit_message>
updated the github doc
</commit_message>
<xml_diff>
--- a/Github_My_Collection.docx
+++ b/Github_My_Collection.docx
@@ -377,17 +377,8 @@
           <w:sz w:val="22"/>
           <w:szCs w:val="22"/>
         </w:rPr>
-        <w:t xml:space="preserve">  //final push to the </w:t>
-      </w:r>
-      <w:proofErr w:type="spellStart"/>
-      <w:r>
-        <w:rPr>
-          <w:sz w:val="22"/>
-          <w:szCs w:val="22"/>
-        </w:rPr>
-        <w:t>github</w:t>
-      </w:r>
-      <w:proofErr w:type="spellEnd"/>
+        <w:t xml:space="preserve">  //final push to the github</w:t>
+      </w:r>
     </w:p>
     <w:p>
       <w:pPr>
@@ -1190,6 +1181,1296 @@
           <w:szCs w:val="22"/>
         </w:rPr>
       </w:pPr>
+    </w:p>
+    <w:p>
+      <w:pPr>
+        <w:pStyle w:val="ListParagraph"/>
+        <w:numPr>
+          <w:ilvl w:val="0"/>
+          <w:numId w:val="6"/>
+        </w:numPr>
+        <w:rPr>
+          <w:color w:val="215E99" w:themeColor="text2" w:themeTint="BF"/>
+          <w:sz w:val="22"/>
+          <w:szCs w:val="22"/>
+        </w:rPr>
+      </w:pPr>
+      <w:r>
+        <w:rPr>
+          <w:color w:val="215E99" w:themeColor="text2" w:themeTint="BF"/>
+          <w:sz w:val="22"/>
+          <w:szCs w:val="22"/>
+        </w:rPr>
+        <w:t>GitHub cloning through SSH</w:t>
+      </w:r>
+    </w:p>
+    <w:p>
+      <w:pPr>
+        <w:pStyle w:val="ListParagraph"/>
+      </w:pPr>
+      <w:r>
+        <w:t>git remote set-</w:t>
+      </w:r>
+      <w:proofErr w:type="spellStart"/>
+      <w:r>
+        <w:t>url</w:t>
+      </w:r>
+      <w:proofErr w:type="spellEnd"/>
+      <w:r>
+        <w:t xml:space="preserve"> origin </w:t>
+      </w:r>
+      <w:hyperlink r:id="rId6" w:history="1">
+        <w:r>
+          <w:rPr>
+            <w:rStyle w:val="Hyperlink"/>
+            <w:rFonts w:ascii="Times New Roman" w:hAnsi="Times New Roman" w:cs="Times New Roman"/>
+            <w:sz w:val="28"/>
+            <w:szCs w:val="28"/>
+          </w:rPr>
+          <w:t>git@github.com:Soyebsoyeb/Spamurai.git</w:t>
+        </w:r>
+      </w:hyperlink>
+      <w:r>
+        <w:br/>
+        <w:t>we need to do this in a repo to use ssh</w:t>
+      </w:r>
+      <w:r>
+        <w:t>,</w:t>
+      </w:r>
+      <w:r>
+        <w:t xml:space="preserve"> if we clone through https like</w:t>
+      </w:r>
+      <w:r>
+        <w:br/>
+      </w:r>
+      <w:r>
+        <w:t xml:space="preserve">git clone </w:t>
+      </w:r>
+      <w:hyperlink r:id="rId7" w:history="1">
+        <w:r>
+          <w:rPr>
+            <w:rStyle w:val="Hyperlink"/>
+            <w:rFonts w:ascii="Times New Roman" w:hAnsi="Times New Roman" w:cs="Times New Roman"/>
+            <w:sz w:val="28"/>
+            <w:szCs w:val="28"/>
+          </w:rPr>
+          <w:t>https://github.com/Soyebsoyeb/Spamurai.git</w:t>
+        </w:r>
+      </w:hyperlink>
+    </w:p>
+    <w:p>
+      <w:pPr>
+        <w:pStyle w:val="ListParagraph"/>
+      </w:pPr>
+      <w:r>
+        <w:t>once per repo.</w:t>
+      </w:r>
+      <w:r>
+        <w:t xml:space="preserve"> </w:t>
+      </w:r>
+      <w:r>
+        <w:t xml:space="preserve">but if </w:t>
+      </w:r>
+      <w:proofErr w:type="gramStart"/>
+      <w:r>
+        <w:t>its</w:t>
+      </w:r>
+      <w:proofErr w:type="gramEnd"/>
+      <w:r>
+        <w:t xml:space="preserve"> cloned like</w:t>
+      </w:r>
+      <w:r>
+        <w:t xml:space="preserve"> -</w:t>
+      </w:r>
+      <w:r>
+        <w:br/>
+      </w:r>
+      <w:r>
+        <w:t xml:space="preserve">git clone </w:t>
+      </w:r>
+      <w:hyperlink r:id="rId8" w:history="1">
+        <w:r>
+          <w:rPr>
+            <w:rStyle w:val="Hyperlink"/>
+            <w:rFonts w:ascii="Times New Roman" w:hAnsi="Times New Roman" w:cs="Times New Roman"/>
+            <w:sz w:val="28"/>
+            <w:szCs w:val="28"/>
+          </w:rPr>
+          <w:t>git@github.com:Soyebsoyeb/Spamurai.git</w:t>
+        </w:r>
+      </w:hyperlink>
+      <w:r>
+        <w:br/>
+        <w:t>no requirement</w:t>
+      </w:r>
+      <w:r>
+        <w:t xml:space="preserve"> to set origin ssh can be used directly.</w:t>
+      </w:r>
+    </w:p>
+    <w:p>
+      <w:pPr>
+        <w:pStyle w:val="ListParagraph"/>
+      </w:pPr>
+    </w:p>
+    <w:p>
+      <w:pPr>
+        <w:pStyle w:val="ListParagraph"/>
+        <w:numPr>
+          <w:ilvl w:val="0"/>
+          <w:numId w:val="6"/>
+        </w:numPr>
+        <w:tabs>
+          <w:tab w:val="left" w:pos="1320"/>
+        </w:tabs>
+        <w:rPr>
+          <w:rFonts w:ascii="Times New Roman" w:hAnsi="Times New Roman" w:cs="Times New Roman"/>
+          <w:color w:val="215E99" w:themeColor="text2" w:themeTint="BF"/>
+          <w:sz w:val="28"/>
+          <w:szCs w:val="28"/>
+        </w:rPr>
+      </w:pPr>
+      <w:r>
+        <w:rPr>
+          <w:rFonts w:cs="Times New Roman"/>
+          <w:b/>
+          <w:bCs/>
+          <w:color w:val="215E99" w:themeColor="text2" w:themeTint="BF"/>
+          <w:sz w:val="22"/>
+          <w:szCs w:val="22"/>
+        </w:rPr>
+        <w:t>Why We Use Branches in Git</w:t>
+      </w:r>
+    </w:p>
+    <w:p>
+      <w:pPr>
+        <w:tabs>
+          <w:tab w:val="left" w:pos="1320"/>
+        </w:tabs>
+        <w:ind w:left="720"/>
+        <w:rPr>
+          <w:rFonts w:cs="Times New Roman"/>
+          <w:sz w:val="22"/>
+          <w:szCs w:val="22"/>
+        </w:rPr>
+      </w:pPr>
+      <w:r>
+        <w:rPr>
+          <w:rFonts w:cs="Times New Roman"/>
+          <w:sz w:val="22"/>
+          <w:szCs w:val="22"/>
+        </w:rPr>
+        <w:t>A branch in Git allows developers to work on new features, bug fixes, or experiments without affecting the main (stable) version of the project.</w:t>
+      </w:r>
+    </w:p>
+    <w:p>
+      <w:pPr>
+        <w:tabs>
+          <w:tab w:val="left" w:pos="1320"/>
+        </w:tabs>
+        <w:ind w:left="720"/>
+        <w:rPr>
+          <w:rFonts w:cs="Times New Roman"/>
+          <w:sz w:val="22"/>
+          <w:szCs w:val="22"/>
+        </w:rPr>
+      </w:pPr>
+      <w:r>
+        <w:rPr>
+          <w:rFonts w:cs="Times New Roman"/>
+          <w:sz w:val="22"/>
+          <w:szCs w:val="22"/>
+        </w:rPr>
+        <w:t>The main branch should always contain stable, working code. By creating a separate branch:</w:t>
+      </w:r>
+    </w:p>
+    <w:p>
+      <w:pPr>
+        <w:numPr>
+          <w:ilvl w:val="0"/>
+          <w:numId w:val="7"/>
+        </w:numPr>
+        <w:tabs>
+          <w:tab w:val="clear" w:pos="720"/>
+          <w:tab w:val="left" w:pos="1320"/>
+          <w:tab w:val="num" w:pos="1440"/>
+        </w:tabs>
+        <w:ind w:left="1440"/>
+        <w:rPr>
+          <w:rFonts w:cs="Times New Roman"/>
+          <w:sz w:val="22"/>
+          <w:szCs w:val="22"/>
+        </w:rPr>
+      </w:pPr>
+      <w:r>
+        <w:rPr>
+          <w:rFonts w:cs="Times New Roman"/>
+          <w:sz w:val="22"/>
+          <w:szCs w:val="22"/>
+        </w:rPr>
+        <w:t>Changes are isolated and safe</w:t>
+      </w:r>
+    </w:p>
+    <w:p>
+      <w:pPr>
+        <w:numPr>
+          <w:ilvl w:val="0"/>
+          <w:numId w:val="7"/>
+        </w:numPr>
+        <w:tabs>
+          <w:tab w:val="clear" w:pos="720"/>
+          <w:tab w:val="left" w:pos="1320"/>
+          <w:tab w:val="num" w:pos="1440"/>
+        </w:tabs>
+        <w:ind w:left="1440"/>
+        <w:rPr>
+          <w:rFonts w:cs="Times New Roman"/>
+          <w:sz w:val="22"/>
+          <w:szCs w:val="22"/>
+        </w:rPr>
+      </w:pPr>
+      <w:r>
+        <w:rPr>
+          <w:rFonts w:cs="Times New Roman"/>
+          <w:sz w:val="22"/>
+          <w:szCs w:val="22"/>
+        </w:rPr>
+        <w:t>The main project remains stable</w:t>
+      </w:r>
+    </w:p>
+    <w:p>
+      <w:pPr>
+        <w:numPr>
+          <w:ilvl w:val="0"/>
+          <w:numId w:val="7"/>
+        </w:numPr>
+        <w:tabs>
+          <w:tab w:val="clear" w:pos="720"/>
+          <w:tab w:val="left" w:pos="1320"/>
+          <w:tab w:val="num" w:pos="1440"/>
+        </w:tabs>
+        <w:ind w:left="1440"/>
+        <w:rPr>
+          <w:rFonts w:cs="Times New Roman"/>
+          <w:sz w:val="22"/>
+          <w:szCs w:val="22"/>
+        </w:rPr>
+      </w:pPr>
+      <w:r>
+        <w:rPr>
+          <w:rFonts w:cs="Times New Roman"/>
+          <w:sz w:val="22"/>
+          <w:szCs w:val="22"/>
+        </w:rPr>
+        <w:t>Features and fixes can be reviewed before merging</w:t>
+      </w:r>
+    </w:p>
+    <w:p>
+      <w:pPr>
+        <w:numPr>
+          <w:ilvl w:val="0"/>
+          <w:numId w:val="7"/>
+        </w:numPr>
+        <w:tabs>
+          <w:tab w:val="clear" w:pos="720"/>
+          <w:tab w:val="left" w:pos="1320"/>
+          <w:tab w:val="num" w:pos="1440"/>
+        </w:tabs>
+        <w:ind w:left="1440"/>
+        <w:rPr>
+          <w:rFonts w:cs="Times New Roman"/>
+          <w:sz w:val="22"/>
+          <w:szCs w:val="22"/>
+        </w:rPr>
+      </w:pPr>
+      <w:r>
+        <w:rPr>
+          <w:rFonts w:cs="Times New Roman"/>
+          <w:sz w:val="22"/>
+          <w:szCs w:val="22"/>
+        </w:rPr>
+        <w:t>Multiple developers can work simultaneously without conflicts</w:t>
+      </w:r>
+    </w:p>
+    <w:p>
+      <w:pPr>
+        <w:tabs>
+          <w:tab w:val="left" w:pos="1320"/>
+        </w:tabs>
+        <w:ind w:left="720"/>
+        <w:rPr>
+          <w:rFonts w:cs="Times New Roman"/>
+          <w:sz w:val="22"/>
+          <w:szCs w:val="22"/>
+        </w:rPr>
+      </w:pPr>
+      <w:r>
+        <w:rPr>
+          <w:rFonts w:cs="Times New Roman"/>
+          <w:sz w:val="22"/>
+          <w:szCs w:val="22"/>
+        </w:rPr>
+        <w:t>Branches help maintain clean project structure and follow professional development practices used in the industry.</w:t>
+      </w:r>
+    </w:p>
+    <w:p>
+      <w:pPr>
+        <w:tabs>
+          <w:tab w:val="left" w:pos="1320"/>
+        </w:tabs>
+        <w:ind w:left="720"/>
+        <w:rPr>
+          <w:rFonts w:cs="Times New Roman"/>
+          <w:sz w:val="22"/>
+          <w:szCs w:val="22"/>
+        </w:rPr>
+      </w:pPr>
+      <w:r>
+        <w:rPr>
+          <w:rFonts w:cs="Times New Roman"/>
+          <w:sz w:val="22"/>
+          <w:szCs w:val="22"/>
+        </w:rPr>
+        <w:pict w14:anchorId="5736F38C">
+          <v:rect id="_x0000_i1025" style="width:0;height:1.5pt" o:hralign="center" o:hrstd="t" o:hr="t" fillcolor="#a0a0a0" stroked="f"/>
+        </w:pict>
+      </w:r>
+    </w:p>
+    <w:p>
+      <w:pPr>
+        <w:tabs>
+          <w:tab w:val="left" w:pos="1320"/>
+        </w:tabs>
+        <w:ind w:left="720"/>
+        <w:rPr>
+          <w:rFonts w:cs="Times New Roman"/>
+          <w:b/>
+          <w:bCs/>
+          <w:sz w:val="22"/>
+          <w:szCs w:val="22"/>
+        </w:rPr>
+      </w:pPr>
+      <w:r>
+        <w:rPr>
+          <w:rFonts w:cs="Times New Roman"/>
+          <w:b/>
+          <w:bCs/>
+          <w:sz w:val="22"/>
+          <w:szCs w:val="22"/>
+        </w:rPr>
+        <w:t>Common Git Branch Commands</w:t>
+      </w:r>
+    </w:p>
+    <w:p>
+      <w:pPr>
+        <w:tabs>
+          <w:tab w:val="left" w:pos="1320"/>
+        </w:tabs>
+        <w:ind w:left="720"/>
+        <w:rPr>
+          <w:rFonts w:cs="Times New Roman"/>
+          <w:b/>
+          <w:bCs/>
+          <w:sz w:val="22"/>
+          <w:szCs w:val="22"/>
+        </w:rPr>
+      </w:pPr>
+      <w:r>
+        <w:rPr>
+          <w:rFonts w:cs="Times New Roman"/>
+          <w:b/>
+          <w:bCs/>
+          <w:sz w:val="22"/>
+          <w:szCs w:val="22"/>
+        </w:rPr>
+        <w:t>1️</w:t>
+      </w:r>
+      <w:r>
+        <w:rPr>
+          <w:rFonts w:ascii="Segoe UI Symbol" w:hAnsi="Segoe UI Symbol" w:cs="Segoe UI Symbol"/>
+          <w:b/>
+          <w:bCs/>
+          <w:sz w:val="22"/>
+          <w:szCs w:val="22"/>
+        </w:rPr>
+        <w:t>⃣</w:t>
+      </w:r>
+      <w:r>
+        <w:rPr>
+          <w:rFonts w:cs="Times New Roman"/>
+          <w:b/>
+          <w:bCs/>
+          <w:sz w:val="22"/>
+          <w:szCs w:val="22"/>
+        </w:rPr>
+        <w:t xml:space="preserve"> Create and switch to a new branch</w:t>
+      </w:r>
+    </w:p>
+    <w:p>
+      <w:pPr>
+        <w:tabs>
+          <w:tab w:val="left" w:pos="1320"/>
+        </w:tabs>
+        <w:ind w:left="720"/>
+        <w:rPr>
+          <w:rFonts w:cs="Times New Roman"/>
+          <w:sz w:val="22"/>
+          <w:szCs w:val="22"/>
+        </w:rPr>
+      </w:pPr>
+      <w:r>
+        <w:rPr>
+          <w:rFonts w:cs="Times New Roman"/>
+          <w:sz w:val="22"/>
+          <w:szCs w:val="22"/>
+          <w:highlight w:val="cyan"/>
+        </w:rPr>
+        <w:t>git checkout -b branch-name</w:t>
+      </w:r>
+    </w:p>
+    <w:p>
+      <w:pPr>
+        <w:tabs>
+          <w:tab w:val="left" w:pos="1320"/>
+        </w:tabs>
+        <w:ind w:left="720"/>
+        <w:rPr>
+          <w:rFonts w:cs="Times New Roman"/>
+          <w:sz w:val="22"/>
+          <w:szCs w:val="22"/>
+        </w:rPr>
+      </w:pPr>
+      <w:r>
+        <w:rPr>
+          <w:rFonts w:cs="Times New Roman"/>
+          <w:sz w:val="22"/>
+          <w:szCs w:val="22"/>
+        </w:rPr>
+        <w:t>Example:</w:t>
+      </w:r>
+    </w:p>
+    <w:p>
+      <w:pPr>
+        <w:tabs>
+          <w:tab w:val="left" w:pos="1320"/>
+        </w:tabs>
+        <w:ind w:left="720"/>
+        <w:rPr>
+          <w:rFonts w:cs="Times New Roman"/>
+          <w:sz w:val="22"/>
+          <w:szCs w:val="22"/>
+        </w:rPr>
+      </w:pPr>
+      <w:r>
+        <w:rPr>
+          <w:rFonts w:cs="Times New Roman"/>
+          <w:sz w:val="22"/>
+          <w:szCs w:val="22"/>
+        </w:rPr>
+        <w:t>git checkout -b feature-login</w:t>
+      </w:r>
+    </w:p>
+    <w:p>
+      <w:pPr>
+        <w:tabs>
+          <w:tab w:val="left" w:pos="1320"/>
+        </w:tabs>
+        <w:ind w:left="720"/>
+        <w:rPr>
+          <w:rFonts w:cs="Times New Roman"/>
+          <w:sz w:val="22"/>
+          <w:szCs w:val="22"/>
+        </w:rPr>
+      </w:pPr>
+      <w:r>
+        <w:rPr>
+          <w:rFonts w:cs="Times New Roman"/>
+          <w:sz w:val="22"/>
+          <w:szCs w:val="22"/>
+        </w:rPr>
+        <w:pict w14:anchorId="722A157A">
+          <v:rect id="_x0000_i1026" style="width:0;height:1.5pt" o:hralign="center" o:hrstd="t" o:hr="t" fillcolor="#a0a0a0" stroked="f"/>
+        </w:pict>
+      </w:r>
+    </w:p>
+    <w:p>
+      <w:pPr>
+        <w:tabs>
+          <w:tab w:val="left" w:pos="1320"/>
+        </w:tabs>
+        <w:ind w:left="720"/>
+        <w:rPr>
+          <w:rFonts w:cs="Times New Roman"/>
+          <w:b/>
+          <w:bCs/>
+          <w:sz w:val="22"/>
+          <w:szCs w:val="22"/>
+        </w:rPr>
+      </w:pPr>
+      <w:r>
+        <w:rPr>
+          <w:rFonts w:cs="Times New Roman"/>
+          <w:b/>
+          <w:bCs/>
+          <w:sz w:val="22"/>
+          <w:szCs w:val="22"/>
+        </w:rPr>
+        <w:t>2️</w:t>
+      </w:r>
+      <w:r>
+        <w:rPr>
+          <w:rFonts w:ascii="Segoe UI Symbol" w:hAnsi="Segoe UI Symbol" w:cs="Segoe UI Symbol"/>
+          <w:b/>
+          <w:bCs/>
+          <w:sz w:val="22"/>
+          <w:szCs w:val="22"/>
+        </w:rPr>
+        <w:t>⃣</w:t>
+      </w:r>
+      <w:r>
+        <w:rPr>
+          <w:rFonts w:cs="Times New Roman"/>
+          <w:b/>
+          <w:bCs/>
+          <w:sz w:val="22"/>
+          <w:szCs w:val="22"/>
+        </w:rPr>
+        <w:t xml:space="preserve"> See all branches</w:t>
+      </w:r>
+    </w:p>
+    <w:p>
+      <w:pPr>
+        <w:tabs>
+          <w:tab w:val="left" w:pos="1320"/>
+        </w:tabs>
+        <w:ind w:left="720"/>
+        <w:rPr>
+          <w:rFonts w:cs="Times New Roman"/>
+          <w:sz w:val="22"/>
+          <w:szCs w:val="22"/>
+        </w:rPr>
+      </w:pPr>
+      <w:r>
+        <w:rPr>
+          <w:rFonts w:cs="Times New Roman"/>
+          <w:sz w:val="22"/>
+          <w:szCs w:val="22"/>
+          <w:highlight w:val="cyan"/>
+        </w:rPr>
+        <w:t>git branch</w:t>
+      </w:r>
+    </w:p>
+    <w:p>
+      <w:pPr>
+        <w:tabs>
+          <w:tab w:val="left" w:pos="1320"/>
+        </w:tabs>
+        <w:ind w:left="720"/>
+        <w:rPr>
+          <w:rFonts w:cs="Times New Roman"/>
+          <w:sz w:val="22"/>
+          <w:szCs w:val="22"/>
+        </w:rPr>
+      </w:pPr>
+      <w:r>
+        <w:rPr>
+          <w:rFonts w:cs="Times New Roman"/>
+          <w:sz w:val="22"/>
+          <w:szCs w:val="22"/>
+        </w:rPr>
+        <w:pict w14:anchorId="5386DE6F">
+          <v:rect id="_x0000_i1027" style="width:0;height:1.5pt" o:hralign="center" o:hrstd="t" o:hr="t" fillcolor="#a0a0a0" stroked="f"/>
+        </w:pict>
+      </w:r>
+    </w:p>
+    <w:p>
+      <w:pPr>
+        <w:tabs>
+          <w:tab w:val="left" w:pos="1320"/>
+        </w:tabs>
+        <w:ind w:left="720"/>
+        <w:rPr>
+          <w:rFonts w:cs="Times New Roman"/>
+          <w:b/>
+          <w:bCs/>
+          <w:sz w:val="22"/>
+          <w:szCs w:val="22"/>
+        </w:rPr>
+      </w:pPr>
+      <w:r>
+        <w:rPr>
+          <w:rFonts w:cs="Times New Roman"/>
+          <w:b/>
+          <w:bCs/>
+          <w:sz w:val="22"/>
+          <w:szCs w:val="22"/>
+        </w:rPr>
+        <w:t>3️</w:t>
+      </w:r>
+      <w:r>
+        <w:rPr>
+          <w:rFonts w:ascii="Segoe UI Symbol" w:hAnsi="Segoe UI Symbol" w:cs="Segoe UI Symbol"/>
+          <w:b/>
+          <w:bCs/>
+          <w:sz w:val="22"/>
+          <w:szCs w:val="22"/>
+        </w:rPr>
+        <w:t>⃣</w:t>
+      </w:r>
+      <w:r>
+        <w:rPr>
+          <w:rFonts w:cs="Times New Roman"/>
+          <w:b/>
+          <w:bCs/>
+          <w:sz w:val="22"/>
+          <w:szCs w:val="22"/>
+        </w:rPr>
+        <w:t xml:space="preserve"> Switch to another branch</w:t>
+      </w:r>
+    </w:p>
+    <w:p>
+      <w:pPr>
+        <w:tabs>
+          <w:tab w:val="left" w:pos="1320"/>
+        </w:tabs>
+        <w:ind w:left="720"/>
+        <w:rPr>
+          <w:rFonts w:cs="Times New Roman"/>
+          <w:sz w:val="22"/>
+          <w:szCs w:val="22"/>
+        </w:rPr>
+      </w:pPr>
+      <w:r>
+        <w:rPr>
+          <w:rFonts w:cs="Times New Roman"/>
+          <w:sz w:val="22"/>
+          <w:szCs w:val="22"/>
+          <w:highlight w:val="cyan"/>
+        </w:rPr>
+        <w:lastRenderedPageBreak/>
+        <w:t>git checkout branch-name</w:t>
+      </w:r>
+    </w:p>
+    <w:p>
+      <w:pPr>
+        <w:tabs>
+          <w:tab w:val="left" w:pos="1320"/>
+        </w:tabs>
+        <w:ind w:left="720"/>
+        <w:rPr>
+          <w:rFonts w:cs="Times New Roman"/>
+          <w:sz w:val="22"/>
+          <w:szCs w:val="22"/>
+        </w:rPr>
+      </w:pPr>
+      <w:r>
+        <w:rPr>
+          <w:rFonts w:cs="Times New Roman"/>
+          <w:sz w:val="22"/>
+          <w:szCs w:val="22"/>
+        </w:rPr>
+        <w:pict w14:anchorId="78101E90">
+          <v:rect id="_x0000_i1028" style="width:0;height:1.5pt" o:hralign="center" o:hrstd="t" o:hr="t" fillcolor="#a0a0a0" stroked="f"/>
+        </w:pict>
+      </w:r>
+    </w:p>
+    <w:p>
+      <w:pPr>
+        <w:tabs>
+          <w:tab w:val="left" w:pos="1320"/>
+        </w:tabs>
+        <w:ind w:left="720"/>
+        <w:rPr>
+          <w:rFonts w:cs="Times New Roman"/>
+          <w:b/>
+          <w:bCs/>
+          <w:sz w:val="22"/>
+          <w:szCs w:val="22"/>
+        </w:rPr>
+      </w:pPr>
+      <w:r>
+        <w:rPr>
+          <w:rFonts w:cs="Times New Roman"/>
+          <w:b/>
+          <w:bCs/>
+          <w:sz w:val="22"/>
+          <w:szCs w:val="22"/>
+        </w:rPr>
+        <w:t>4️</w:t>
+      </w:r>
+      <w:r>
+        <w:rPr>
+          <w:rFonts w:ascii="Segoe UI Symbol" w:hAnsi="Segoe UI Symbol" w:cs="Segoe UI Symbol"/>
+          <w:b/>
+          <w:bCs/>
+          <w:sz w:val="22"/>
+          <w:szCs w:val="22"/>
+        </w:rPr>
+        <w:t>⃣</w:t>
+      </w:r>
+      <w:r>
+        <w:rPr>
+          <w:rFonts w:cs="Times New Roman"/>
+          <w:b/>
+          <w:bCs/>
+          <w:sz w:val="22"/>
+          <w:szCs w:val="22"/>
+        </w:rPr>
+        <w:t xml:space="preserve"> Push branch to GitHub</w:t>
+      </w:r>
+    </w:p>
+    <w:p>
+      <w:pPr>
+        <w:tabs>
+          <w:tab w:val="left" w:pos="1320"/>
+        </w:tabs>
+        <w:ind w:left="720"/>
+        <w:rPr>
+          <w:rFonts w:cs="Times New Roman"/>
+          <w:sz w:val="22"/>
+          <w:szCs w:val="22"/>
+        </w:rPr>
+      </w:pPr>
+      <w:r>
+        <w:rPr>
+          <w:rFonts w:cs="Times New Roman"/>
+          <w:sz w:val="22"/>
+          <w:szCs w:val="22"/>
+          <w:highlight w:val="cyan"/>
+        </w:rPr>
+        <w:t>git push origin branch-name</w:t>
+      </w:r>
+    </w:p>
+    <w:p>
+      <w:pPr>
+        <w:tabs>
+          <w:tab w:val="left" w:pos="1320"/>
+        </w:tabs>
+        <w:ind w:left="720"/>
+        <w:rPr>
+          <w:rFonts w:cs="Times New Roman"/>
+          <w:sz w:val="22"/>
+          <w:szCs w:val="22"/>
+        </w:rPr>
+      </w:pPr>
+      <w:r>
+        <w:rPr>
+          <w:rFonts w:cs="Times New Roman"/>
+          <w:sz w:val="22"/>
+          <w:szCs w:val="22"/>
+        </w:rPr>
+        <w:pict w14:anchorId="1D717D24">
+          <v:rect id="_x0000_i1029" style="width:0;height:1.5pt" o:hralign="center" o:hrstd="t" o:hr="t" fillcolor="#a0a0a0" stroked="f"/>
+        </w:pict>
+      </w:r>
+    </w:p>
+    <w:p>
+      <w:pPr>
+        <w:tabs>
+          <w:tab w:val="left" w:pos="1320"/>
+        </w:tabs>
+        <w:ind w:left="720"/>
+        <w:rPr>
+          <w:rFonts w:cs="Times New Roman"/>
+          <w:b/>
+          <w:bCs/>
+          <w:sz w:val="22"/>
+          <w:szCs w:val="22"/>
+        </w:rPr>
+      </w:pPr>
+      <w:r>
+        <w:rPr>
+          <w:rFonts w:cs="Times New Roman"/>
+          <w:b/>
+          <w:bCs/>
+          <w:sz w:val="22"/>
+          <w:szCs w:val="22"/>
+        </w:rPr>
+        <w:t>5️</w:t>
+      </w:r>
+      <w:r>
+        <w:rPr>
+          <w:rFonts w:ascii="Segoe UI Symbol" w:hAnsi="Segoe UI Symbol" w:cs="Segoe UI Symbol"/>
+          <w:b/>
+          <w:bCs/>
+          <w:sz w:val="22"/>
+          <w:szCs w:val="22"/>
+        </w:rPr>
+        <w:t>⃣</w:t>
+      </w:r>
+      <w:r>
+        <w:rPr>
+          <w:rFonts w:cs="Times New Roman"/>
+          <w:b/>
+          <w:bCs/>
+          <w:sz w:val="22"/>
+          <w:szCs w:val="22"/>
+        </w:rPr>
+        <w:t xml:space="preserve"> Merge branch into main</w:t>
+      </w:r>
+    </w:p>
+    <w:p>
+      <w:pPr>
+        <w:tabs>
+          <w:tab w:val="left" w:pos="1320"/>
+        </w:tabs>
+        <w:ind w:left="720"/>
+        <w:rPr>
+          <w:rFonts w:cs="Times New Roman"/>
+          <w:sz w:val="22"/>
+          <w:szCs w:val="22"/>
+        </w:rPr>
+      </w:pPr>
+      <w:r>
+        <w:rPr>
+          <w:rFonts w:cs="Times New Roman"/>
+          <w:sz w:val="22"/>
+          <w:szCs w:val="22"/>
+        </w:rPr>
+        <w:t>First switch to main:</w:t>
+      </w:r>
+    </w:p>
+    <w:p>
+      <w:pPr>
+        <w:tabs>
+          <w:tab w:val="left" w:pos="1320"/>
+        </w:tabs>
+        <w:ind w:left="720"/>
+        <w:rPr>
+          <w:rFonts w:cs="Times New Roman"/>
+          <w:sz w:val="22"/>
+          <w:szCs w:val="22"/>
+        </w:rPr>
+      </w:pPr>
+      <w:r>
+        <w:rPr>
+          <w:rFonts w:cs="Times New Roman"/>
+          <w:sz w:val="22"/>
+          <w:szCs w:val="22"/>
+          <w:highlight w:val="cyan"/>
+        </w:rPr>
+        <w:t>git checkout main</w:t>
+      </w:r>
+    </w:p>
+    <w:p>
+      <w:pPr>
+        <w:tabs>
+          <w:tab w:val="left" w:pos="1320"/>
+        </w:tabs>
+        <w:ind w:left="720"/>
+        <w:rPr>
+          <w:rFonts w:cs="Times New Roman"/>
+          <w:sz w:val="22"/>
+          <w:szCs w:val="22"/>
+        </w:rPr>
+      </w:pPr>
+      <w:r>
+        <w:rPr>
+          <w:rFonts w:cs="Times New Roman"/>
+          <w:sz w:val="22"/>
+          <w:szCs w:val="22"/>
+        </w:rPr>
+        <w:t>Then merge:</w:t>
+      </w:r>
+    </w:p>
+    <w:p>
+      <w:pPr>
+        <w:tabs>
+          <w:tab w:val="left" w:pos="1320"/>
+        </w:tabs>
+        <w:ind w:left="720"/>
+        <w:rPr>
+          <w:rFonts w:cs="Times New Roman"/>
+          <w:sz w:val="22"/>
+          <w:szCs w:val="22"/>
+        </w:rPr>
+      </w:pPr>
+      <w:r>
+        <w:rPr>
+          <w:rFonts w:cs="Times New Roman"/>
+          <w:sz w:val="22"/>
+          <w:szCs w:val="22"/>
+          <w:highlight w:val="cyan"/>
+        </w:rPr>
+        <w:t>git merge branch-name</w:t>
+      </w:r>
+    </w:p>
+    <w:p>
+      <w:pPr>
+        <w:pStyle w:val="ListParagraph"/>
+        <w:numPr>
+          <w:ilvl w:val="0"/>
+          <w:numId w:val="7"/>
+        </w:numPr>
+        <w:rPr>
+          <w:color w:val="215E99" w:themeColor="text2" w:themeTint="BF"/>
+          <w:sz w:val="22"/>
+          <w:szCs w:val="22"/>
+        </w:rPr>
+      </w:pPr>
+      <w:r>
+        <w:rPr>
+          <w:color w:val="215E99" w:themeColor="text2" w:themeTint="BF"/>
+          <w:sz w:val="22"/>
+          <w:szCs w:val="22"/>
+        </w:rPr>
+        <w:t>Gitignore</w:t>
+      </w:r>
+    </w:p>
+    <w:p>
+      <w:pPr>
+        <w:pStyle w:val="ListParagraph"/>
+        <w:rPr>
+          <w:color w:val="000000" w:themeColor="text1"/>
+          <w:sz w:val="22"/>
+          <w:szCs w:val="22"/>
+        </w:rPr>
+      </w:pPr>
+      <w:r>
+        <w:rPr>
+          <w:color w:val="000000" w:themeColor="text1"/>
+          <w:sz w:val="22"/>
+          <w:szCs w:val="22"/>
+        </w:rPr>
+        <w:t>echo "</w:t>
+      </w:r>
+      <w:r>
+        <w:rPr>
+          <w:color w:val="000000" w:themeColor="text1"/>
+          <w:sz w:val="22"/>
+          <w:szCs w:val="22"/>
+        </w:rPr>
+        <w:t>filename</w:t>
+      </w:r>
+      <w:r>
+        <w:rPr>
+          <w:color w:val="000000" w:themeColor="text1"/>
+          <w:sz w:val="22"/>
+          <w:szCs w:val="22"/>
+        </w:rPr>
+        <w:t>/" &gt;</w:t>
+      </w:r>
+      <w:proofErr w:type="gramStart"/>
+      <w:r>
+        <w:rPr>
+          <w:color w:val="000000" w:themeColor="text1"/>
+          <w:sz w:val="22"/>
+          <w:szCs w:val="22"/>
+        </w:rPr>
+        <w:t>&gt; .gitignore</w:t>
+      </w:r>
+      <w:proofErr w:type="gramEnd"/>
+    </w:p>
+    <w:p>
+      <w:pPr>
+        <w:pStyle w:val="ListParagraph"/>
+        <w:rPr>
+          <w:color w:val="000000" w:themeColor="text1"/>
+          <w:sz w:val="22"/>
+          <w:szCs w:val="22"/>
+        </w:rPr>
+      </w:pPr>
+      <w:r>
+        <w:rPr>
+          <w:color w:val="000000" w:themeColor="text1"/>
+          <w:sz w:val="22"/>
+          <w:szCs w:val="22"/>
+        </w:rPr>
+        <w:t>echo just writes the filename in terminal, and ‘&lt;&lt;</w:t>
+      </w:r>
+      <w:proofErr w:type="gramStart"/>
+      <w:r>
+        <w:rPr>
+          <w:color w:val="000000" w:themeColor="text1"/>
+          <w:sz w:val="22"/>
+          <w:szCs w:val="22"/>
+        </w:rPr>
+        <w:t>’  means</w:t>
+      </w:r>
+      <w:proofErr w:type="gramEnd"/>
+      <w:r>
+        <w:rPr>
+          <w:color w:val="000000" w:themeColor="text1"/>
+          <w:sz w:val="22"/>
+          <w:szCs w:val="22"/>
+        </w:rPr>
+        <w:t xml:space="preserve"> append the file to the end of gitignore file. </w:t>
+      </w:r>
+      <w:proofErr w:type="gramStart"/>
+      <w:r>
+        <w:rPr>
+          <w:color w:val="000000" w:themeColor="text1"/>
+          <w:sz w:val="22"/>
+          <w:szCs w:val="22"/>
+        </w:rPr>
+        <w:t>So</w:t>
+      </w:r>
+      <w:proofErr w:type="gramEnd"/>
+      <w:r>
+        <w:rPr>
+          <w:color w:val="000000" w:themeColor="text1"/>
+          <w:sz w:val="22"/>
+          <w:szCs w:val="22"/>
+        </w:rPr>
+        <w:t xml:space="preserve"> while pushing it to the github it ignores the files in gitignore and don’t push it.</w:t>
+      </w:r>
+    </w:p>
+    <w:p>
+      <w:pPr>
+        <w:pStyle w:val="ListParagraph"/>
+        <w:numPr>
+          <w:ilvl w:val="0"/>
+          <w:numId w:val="7"/>
+        </w:numPr>
+        <w:rPr>
+          <w:color w:val="215E99" w:themeColor="text2" w:themeTint="BF"/>
+          <w:sz w:val="22"/>
+          <w:szCs w:val="22"/>
+        </w:rPr>
+      </w:pPr>
+      <w:r>
+        <w:rPr>
+          <w:color w:val="215E99" w:themeColor="text2" w:themeTint="BF"/>
+          <w:sz w:val="22"/>
+          <w:szCs w:val="22"/>
+        </w:rPr>
+        <w:t>g</w:t>
+      </w:r>
+      <w:r>
+        <w:rPr>
+          <w:color w:val="215E99" w:themeColor="text2" w:themeTint="BF"/>
+          <w:sz w:val="22"/>
+          <w:szCs w:val="22"/>
+        </w:rPr>
+        <w:t>it remote -v</w:t>
+      </w:r>
+    </w:p>
+    <w:p>
+      <w:pPr>
+        <w:pStyle w:val="ListParagraph"/>
+        <w:rPr>
+          <w:color w:val="000000" w:themeColor="text1"/>
+          <w:sz w:val="22"/>
+          <w:szCs w:val="22"/>
+        </w:rPr>
+      </w:pPr>
+      <w:r>
+        <w:rPr>
+          <w:color w:val="000000" w:themeColor="text1"/>
+          <w:sz w:val="22"/>
+          <w:szCs w:val="22"/>
+        </w:rPr>
+        <w:t>It is used to check the repo I am working on and also upstream.</w:t>
+      </w:r>
+    </w:p>
+    <w:p>
+      <w:pPr>
+        <w:pStyle w:val="ListParagraph"/>
+        <w:numPr>
+          <w:ilvl w:val="0"/>
+          <w:numId w:val="7"/>
+        </w:numPr>
+        <w:rPr>
+          <w:color w:val="215E99" w:themeColor="text2" w:themeTint="BF"/>
+          <w:sz w:val="22"/>
+          <w:szCs w:val="22"/>
+        </w:rPr>
+      </w:pPr>
+      <w:r>
+        <w:rPr>
+          <w:color w:val="215E99" w:themeColor="text2" w:themeTint="BF"/>
+          <w:sz w:val="22"/>
+          <w:szCs w:val="22"/>
+        </w:rPr>
+        <w:t>How to make forked repo up to date with upstream?</w:t>
+      </w:r>
+    </w:p>
+    <w:p>
+      <w:pPr>
+        <w:pStyle w:val="ListParagraph"/>
+        <w:rPr>
+          <w:color w:val="000000" w:themeColor="text1"/>
+          <w:sz w:val="22"/>
+          <w:szCs w:val="22"/>
+        </w:rPr>
+      </w:pPr>
+      <w:r>
+        <w:rPr>
+          <w:color w:val="47D459" w:themeColor="accent3" w:themeTint="99"/>
+          <w:sz w:val="22"/>
+          <w:szCs w:val="22"/>
+        </w:rPr>
+        <w:t>git fetch upstream</w:t>
+      </w:r>
+      <w:r>
+        <w:rPr>
+          <w:color w:val="47D459" w:themeColor="accent3" w:themeTint="99"/>
+          <w:sz w:val="22"/>
+          <w:szCs w:val="22"/>
+        </w:rPr>
+        <w:t xml:space="preserve"> </w:t>
+      </w:r>
+      <w:r>
+        <w:rPr>
+          <w:color w:val="000000" w:themeColor="text1"/>
+          <w:sz w:val="22"/>
+          <w:szCs w:val="22"/>
+        </w:rPr>
+        <w:t xml:space="preserve">(downloads the changes from upstream) -&gt; </w:t>
+      </w:r>
+      <w:r>
+        <w:rPr>
+          <w:color w:val="47D459" w:themeColor="accent3" w:themeTint="99"/>
+          <w:sz w:val="22"/>
+          <w:szCs w:val="22"/>
+        </w:rPr>
+        <w:t>git checkout main</w:t>
+      </w:r>
+      <w:r>
+        <w:rPr>
+          <w:color w:val="47D459" w:themeColor="accent3" w:themeTint="99"/>
+          <w:sz w:val="22"/>
+          <w:szCs w:val="22"/>
+        </w:rPr>
+        <w:t xml:space="preserve"> </w:t>
+      </w:r>
+      <w:r>
+        <w:rPr>
+          <w:color w:val="000000" w:themeColor="text1"/>
+          <w:sz w:val="22"/>
+          <w:szCs w:val="22"/>
+        </w:rPr>
+        <w:t xml:space="preserve">(switch to main branch) -&gt; </w:t>
+      </w:r>
+      <w:r>
+        <w:rPr>
+          <w:color w:val="47D459" w:themeColor="accent3" w:themeTint="99"/>
+          <w:sz w:val="22"/>
+          <w:szCs w:val="22"/>
+        </w:rPr>
+        <w:t xml:space="preserve">git merge upstream/main </w:t>
+      </w:r>
+      <w:r>
+        <w:rPr>
+          <w:color w:val="000000" w:themeColor="text1"/>
+          <w:sz w:val="22"/>
+          <w:szCs w:val="22"/>
+        </w:rPr>
+        <w:t>(merges upstream with main)</w:t>
+      </w:r>
+    </w:p>
+    <w:p>
+      <w:pPr>
+        <w:pStyle w:val="ListParagraph"/>
+        <w:rPr>
+          <w:color w:val="47D459" w:themeColor="accent3" w:themeTint="99"/>
+          <w:sz w:val="22"/>
+          <w:szCs w:val="22"/>
+        </w:rPr>
+      </w:pPr>
+      <w:r>
+        <w:rPr>
+          <w:color w:val="000000" w:themeColor="text1"/>
+          <w:sz w:val="22"/>
+          <w:szCs w:val="22"/>
+        </w:rPr>
+        <w:t xml:space="preserve">or simply use </w:t>
+      </w:r>
+      <w:r>
+        <w:rPr>
+          <w:color w:val="47D459" w:themeColor="accent3" w:themeTint="99"/>
+          <w:sz w:val="22"/>
+          <w:szCs w:val="22"/>
+        </w:rPr>
+        <w:t>git pull upstream main</w:t>
+      </w:r>
+    </w:p>
+    <w:p>
+      <w:pPr>
+        <w:pStyle w:val="ListParagraph"/>
+        <w:numPr>
+          <w:ilvl w:val="0"/>
+          <w:numId w:val="7"/>
+        </w:numPr>
+        <w:rPr>
+          <w:color w:val="215E99" w:themeColor="text2" w:themeTint="BF"/>
+          <w:sz w:val="22"/>
+          <w:szCs w:val="22"/>
+        </w:rPr>
+      </w:pPr>
+      <w:r>
+        <w:rPr>
+          <w:color w:val="215E99" w:themeColor="text2" w:themeTint="BF"/>
+          <w:sz w:val="22"/>
+          <w:szCs w:val="22"/>
+        </w:rPr>
+        <w:t>git branch -d branch-</w:t>
+      </w:r>
+      <w:proofErr w:type="gramStart"/>
+      <w:r>
+        <w:rPr>
+          <w:color w:val="215E99" w:themeColor="text2" w:themeTint="BF"/>
+          <w:sz w:val="22"/>
+          <w:szCs w:val="22"/>
+        </w:rPr>
+        <w:t>name</w:t>
+      </w:r>
+      <w:r>
+        <w:rPr>
+          <w:color w:val="215E99" w:themeColor="text2" w:themeTint="BF"/>
+          <w:sz w:val="22"/>
+          <w:szCs w:val="22"/>
+        </w:rPr>
+        <w:t xml:space="preserve">  </w:t>
+      </w:r>
+      <w:r>
+        <w:rPr>
+          <w:color w:val="000000" w:themeColor="text1"/>
+          <w:sz w:val="22"/>
+          <w:szCs w:val="22"/>
+        </w:rPr>
+        <w:t>deletes</w:t>
+      </w:r>
+      <w:proofErr w:type="gramEnd"/>
+      <w:r>
+        <w:rPr>
+          <w:color w:val="000000" w:themeColor="text1"/>
+          <w:sz w:val="22"/>
+          <w:szCs w:val="22"/>
+        </w:rPr>
+        <w:t xml:space="preserve"> the branch</w:t>
+      </w:r>
+      <w:r>
+        <w:rPr>
+          <w:color w:val="000000" w:themeColor="text1"/>
+          <w:sz w:val="22"/>
+          <w:szCs w:val="22"/>
+        </w:rPr>
+        <w:t xml:space="preserve"> locally </w:t>
+      </w:r>
+      <w:r>
+        <w:rPr>
+          <w:color w:val="215E99" w:themeColor="text2" w:themeTint="BF"/>
+          <w:sz w:val="22"/>
+          <w:szCs w:val="22"/>
+        </w:rPr>
+        <w:t>git push origin --delete adding-readme</w:t>
+      </w:r>
+      <w:r>
+        <w:rPr>
+          <w:color w:val="215E99" w:themeColor="text2" w:themeTint="BF"/>
+          <w:sz w:val="22"/>
+          <w:szCs w:val="22"/>
+        </w:rPr>
+        <w:t xml:space="preserve"> </w:t>
+      </w:r>
+      <w:r>
+        <w:rPr>
+          <w:color w:val="000000" w:themeColor="text1"/>
+          <w:sz w:val="22"/>
+          <w:szCs w:val="22"/>
+        </w:rPr>
+        <w:t>deletes the branch from github too</w:t>
+      </w:r>
     </w:p>
     <w:sectPr>
       <w:pgSz w:w="11906" w:h="16838"/>
@@ -1204,6 +2485,155 @@
 <file path=word/numbering.xml><?xml version="1.0" encoding="utf-8"?>
 <w:numbering xmlns:wpc="http://schemas.microsoft.com/office/word/2010/wordprocessingCanvas" xmlns:cx="http://schemas.microsoft.com/office/drawing/2014/chartex" xmlns:cx1="http://schemas.microsoft.com/office/drawing/2015/9/8/chartex" xmlns:cx2="http://schemas.microsoft.com/office/drawing/2015/10/21/chartex" xmlns:cx3="http://schemas.microsoft.com/office/drawing/2016/5/9/chartex" xmlns:cx4="http://schemas.microsoft.com/office/drawing/2016/5/10/chartex" xmlns:cx5="http://schemas.microsoft.com/office/drawing/2016/5/11/chartex" xmlns:cx6="http://schemas.microsoft.com/office/drawing/2016/5/12/chartex" xmlns:cx7="http://schemas.microsoft.com/office/drawing/2016/5/13/chartex" xmlns:cx8="http://schemas.microsoft.com/office/drawing/2016/5/14/chartex" xmlns:mc="http://schemas.openxmlformats.org/markup-compatibility/2006" xmlns:aink="http://schemas.microsoft.com/office/drawing/2016/ink" xmlns:am3d="http://schemas.microsoft.com/office/drawing/2017/model3d" xmlns:o="urn:schemas-microsoft-com:office:office" xmlns:oel="http://schemas.microsoft.com/office/2019/extlst" xmlns:r="http://schemas.openxmlformats.org/officeDocument/2006/relationships" xmlns:m="http://schemas.openxmlformats.org/officeDocument/2006/math" xmlns:v="urn:schemas-microsoft-com:vml" xmlns:wp14="http://schemas.microsoft.com/office/word/2010/wordprocessingDrawing" xmlns:wp="http://schemas.openxmlformats.org/drawingml/2006/wordprocessingDrawing" xmlns:w10="urn:schemas-microsoft-com:office:word" xmlns:w="http://schemas.openxmlformats.org/wordprocessingml/2006/main" xmlns:w14="http://schemas.microsoft.com/office/word/2010/wordml" xmlns:w15="http://schemas.microsoft.com/office/word/2012/wordml" xmlns:w16cex="http://schemas.microsoft.com/office/word/2018/wordml/cex" xmlns:w16cid="http://schemas.microsoft.com/office/word/2016/wordml/cid" xmlns:w16="http://schemas.microsoft.com/office/word/2018/wordml" xmlns:w16du="http://schemas.microsoft.com/office/word/2023/wordml/word16du" xmlns:w16sdtdh="http://schemas.microsoft.com/office/word/2020/wordml/sdtdatahash" xmlns:w16sdtfl="http://schemas.microsoft.com/office/word/2024/wordml/sdtformatlock" xmlns:w16se="http://schemas.microsoft.com/office/word/2015/wordml/symex" xmlns:wpg="http://schemas.microsoft.com/office/word/2010/wordprocessingGroup" xmlns:wpi="http://schemas.microsoft.com/office/word/2010/wordprocessingInk" xmlns:wne="http://schemas.microsoft.com/office/word/2006/wordml" xmlns:wps="http://schemas.microsoft.com/office/word/2010/wordprocessingShape" mc:Ignorable="w14 w15 w16se w16cid w16 w16cex w16sdtdh w16sdtfl w16du wp14">
   <w:abstractNum w:abstractNumId="0" w15:restartNumberingAfterBreak="0">
+    <w:nsid w:val="03492445"/>
+    <w:multiLevelType w:val="multilevel"/>
+    <w:tmpl w:val="53569338"/>
+    <w:lvl w:ilvl="0">
+      <w:start w:val="1"/>
+      <w:numFmt w:val="bullet"/>
+      <w:lvlText w:val=""/>
+      <w:lvlJc w:val="left"/>
+      <w:pPr>
+        <w:tabs>
+          <w:tab w:val="num" w:pos="720"/>
+        </w:tabs>
+        <w:ind w:left="720" w:hanging="360"/>
+      </w:pPr>
+      <w:rPr>
+        <w:rFonts w:ascii="Symbol" w:hAnsi="Symbol" w:hint="default"/>
+        <w:sz w:val="20"/>
+      </w:rPr>
+    </w:lvl>
+    <w:lvl w:ilvl="1" w:tentative="1">
+      <w:start w:val="1"/>
+      <w:numFmt w:val="bullet"/>
+      <w:lvlText w:val="o"/>
+      <w:lvlJc w:val="left"/>
+      <w:pPr>
+        <w:tabs>
+          <w:tab w:val="num" w:pos="1440"/>
+        </w:tabs>
+        <w:ind w:left="1440" w:hanging="360"/>
+      </w:pPr>
+      <w:rPr>
+        <w:rFonts w:ascii="Courier New" w:hAnsi="Courier New" w:hint="default"/>
+        <w:sz w:val="20"/>
+      </w:rPr>
+    </w:lvl>
+    <w:lvl w:ilvl="2" w:tentative="1">
+      <w:start w:val="1"/>
+      <w:numFmt w:val="bullet"/>
+      <w:lvlText w:val=""/>
+      <w:lvlJc w:val="left"/>
+      <w:pPr>
+        <w:tabs>
+          <w:tab w:val="num" w:pos="2160"/>
+        </w:tabs>
+        <w:ind w:left="2160" w:hanging="360"/>
+      </w:pPr>
+      <w:rPr>
+        <w:rFonts w:ascii="Wingdings" w:hAnsi="Wingdings" w:hint="default"/>
+        <w:sz w:val="20"/>
+      </w:rPr>
+    </w:lvl>
+    <w:lvl w:ilvl="3" w:tentative="1">
+      <w:start w:val="1"/>
+      <w:numFmt w:val="bullet"/>
+      <w:lvlText w:val=""/>
+      <w:lvlJc w:val="left"/>
+      <w:pPr>
+        <w:tabs>
+          <w:tab w:val="num" w:pos="2880"/>
+        </w:tabs>
+        <w:ind w:left="2880" w:hanging="360"/>
+      </w:pPr>
+      <w:rPr>
+        <w:rFonts w:ascii="Wingdings" w:hAnsi="Wingdings" w:hint="default"/>
+        <w:sz w:val="20"/>
+      </w:rPr>
+    </w:lvl>
+    <w:lvl w:ilvl="4" w:tentative="1">
+      <w:start w:val="1"/>
+      <w:numFmt w:val="bullet"/>
+      <w:lvlText w:val=""/>
+      <w:lvlJc w:val="left"/>
+      <w:pPr>
+        <w:tabs>
+          <w:tab w:val="num" w:pos="3600"/>
+        </w:tabs>
+        <w:ind w:left="3600" w:hanging="360"/>
+      </w:pPr>
+      <w:rPr>
+        <w:rFonts w:ascii="Wingdings" w:hAnsi="Wingdings" w:hint="default"/>
+        <w:sz w:val="20"/>
+      </w:rPr>
+    </w:lvl>
+    <w:lvl w:ilvl="5" w:tentative="1">
+      <w:start w:val="1"/>
+      <w:numFmt w:val="bullet"/>
+      <w:lvlText w:val=""/>
+      <w:lvlJc w:val="left"/>
+      <w:pPr>
+        <w:tabs>
+          <w:tab w:val="num" w:pos="4320"/>
+        </w:tabs>
+        <w:ind w:left="4320" w:hanging="360"/>
+      </w:pPr>
+      <w:rPr>
+        <w:rFonts w:ascii="Wingdings" w:hAnsi="Wingdings" w:hint="default"/>
+        <w:sz w:val="20"/>
+      </w:rPr>
+    </w:lvl>
+    <w:lvl w:ilvl="6" w:tentative="1">
+      <w:start w:val="1"/>
+      <w:numFmt w:val="bullet"/>
+      <w:lvlText w:val=""/>
+      <w:lvlJc w:val="left"/>
+      <w:pPr>
+        <w:tabs>
+          <w:tab w:val="num" w:pos="5040"/>
+        </w:tabs>
+        <w:ind w:left="5040" w:hanging="360"/>
+      </w:pPr>
+      <w:rPr>
+        <w:rFonts w:ascii="Wingdings" w:hAnsi="Wingdings" w:hint="default"/>
+        <w:sz w:val="20"/>
+      </w:rPr>
+    </w:lvl>
+    <w:lvl w:ilvl="7" w:tentative="1">
+      <w:start w:val="1"/>
+      <w:numFmt w:val="bullet"/>
+      <w:lvlText w:val=""/>
+      <w:lvlJc w:val="left"/>
+      <w:pPr>
+        <w:tabs>
+          <w:tab w:val="num" w:pos="5760"/>
+        </w:tabs>
+        <w:ind w:left="5760" w:hanging="360"/>
+      </w:pPr>
+      <w:rPr>
+        <w:rFonts w:ascii="Wingdings" w:hAnsi="Wingdings" w:hint="default"/>
+        <w:sz w:val="20"/>
+      </w:rPr>
+    </w:lvl>
+    <w:lvl w:ilvl="8" w:tentative="1">
+      <w:start w:val="1"/>
+      <w:numFmt w:val="bullet"/>
+      <w:lvlText w:val=""/>
+      <w:lvlJc w:val="left"/>
+      <w:pPr>
+        <w:tabs>
+          <w:tab w:val="num" w:pos="6480"/>
+        </w:tabs>
+        <w:ind w:left="6480" w:hanging="360"/>
+      </w:pPr>
+      <w:rPr>
+        <w:rFonts w:ascii="Wingdings" w:hAnsi="Wingdings" w:hint="default"/>
+        <w:sz w:val="20"/>
+      </w:rPr>
+    </w:lvl>
+  </w:abstractNum>
+  <w:abstractNum w:abstractNumId="1" w15:restartNumberingAfterBreak="0">
     <w:nsid w:val="28ED3DA0"/>
     <w:multiLevelType w:val="multilevel"/>
     <w:tmpl w:val="B0B22D8A"/>
@@ -1352,7 +2782,7 @@
       </w:rPr>
     </w:lvl>
   </w:abstractNum>
-  <w:abstractNum w:abstractNumId="1" w15:restartNumberingAfterBreak="0">
+  <w:abstractNum w:abstractNumId="2" w15:restartNumberingAfterBreak="0">
     <w:nsid w:val="306D0472"/>
     <w:multiLevelType w:val="hybridMultilevel"/>
     <w:tmpl w:val="AA180DB8"/>
@@ -1464,7 +2894,7 @@
       </w:rPr>
     </w:lvl>
   </w:abstractNum>
-  <w:abstractNum w:abstractNumId="2" w15:restartNumberingAfterBreak="0">
+  <w:abstractNum w:abstractNumId="3" w15:restartNumberingAfterBreak="0">
     <w:nsid w:val="32ED61C5"/>
     <w:multiLevelType w:val="multilevel"/>
     <w:tmpl w:val="100019DC"/>
@@ -1613,7 +3043,7 @@
       </w:rPr>
     </w:lvl>
   </w:abstractNum>
-  <w:abstractNum w:abstractNumId="3" w15:restartNumberingAfterBreak="0">
+  <w:abstractNum w:abstractNumId="4" w15:restartNumberingAfterBreak="0">
     <w:nsid w:val="3C5957DA"/>
     <w:multiLevelType w:val="hybridMultilevel"/>
     <w:tmpl w:val="9F1A15AE"/>
@@ -1702,7 +3132,7 @@
       </w:pPr>
     </w:lvl>
   </w:abstractNum>
-  <w:abstractNum w:abstractNumId="4" w15:restartNumberingAfterBreak="0">
+  <w:abstractNum w:abstractNumId="5" w15:restartNumberingAfterBreak="0">
     <w:nsid w:val="3D69297E"/>
     <w:multiLevelType w:val="multilevel"/>
     <w:tmpl w:val="2354B2A4"/>
@@ -1851,7 +3281,7 @@
       </w:rPr>
     </w:lvl>
   </w:abstractNum>
-  <w:abstractNum w:abstractNumId="5" w15:restartNumberingAfterBreak="0">
+  <w:abstractNum w:abstractNumId="6" w15:restartNumberingAfterBreak="0">
     <w:nsid w:val="60416484"/>
     <w:multiLevelType w:val="multilevel"/>
     <w:tmpl w:val="B0902AF8"/>
@@ -2001,22 +3431,25 @@
     </w:lvl>
   </w:abstractNum>
   <w:num w:numId="1" w16cid:durableId="1609507880">
+    <w:abstractNumId w:val="2"/>
+  </w:num>
+  <w:num w:numId="2" w16cid:durableId="1145128369">
+    <w:abstractNumId w:val="4"/>
+  </w:num>
+  <w:num w:numId="3" w16cid:durableId="1892643491">
+    <w:abstractNumId w:val="6"/>
+  </w:num>
+  <w:num w:numId="4" w16cid:durableId="719397914">
+    <w:abstractNumId w:val="3"/>
+  </w:num>
+  <w:num w:numId="5" w16cid:durableId="933364770">
     <w:abstractNumId w:val="1"/>
   </w:num>
-  <w:num w:numId="2" w16cid:durableId="1145128369">
-    <w:abstractNumId w:val="3"/>
-  </w:num>
-  <w:num w:numId="3" w16cid:durableId="1892643491">
+  <w:num w:numId="6" w16cid:durableId="1478961384">
     <w:abstractNumId w:val="5"/>
   </w:num>
-  <w:num w:numId="4" w16cid:durableId="719397914">
-    <w:abstractNumId w:val="2"/>
-  </w:num>
-  <w:num w:numId="5" w16cid:durableId="933364770">
+  <w:num w:numId="7" w16cid:durableId="1012800689">
     <w:abstractNumId w:val="0"/>
-  </w:num>
-  <w:num w:numId="6" w16cid:durableId="1478961384">
-    <w:abstractNumId w:val="4"/>
   </w:num>
 </w:numbering>
 </file>
@@ -2960,6 +4393,15 @@
       <w:shd w:val="clear" w:color="auto" w:fill="E1DFDD"/>
     </w:rPr>
   </w:style>
+  <w:style w:type="paragraph" w:styleId="NoSpacing">
+    <w:name w:val="No Spacing"/>
+    <w:uiPriority w:val="1"/>
+    <w:qFormat/>
+    <w:rsid w:val="00240A08"/>
+    <w:pPr>
+      <w:spacing w:after="0" w:line="240" w:lineRule="auto"/>
+    </w:pPr>
+  </w:style>
 </w:styles>
 </file>
 

</xml_diff>